<commit_message>
Deploying to gh-pages from @ Morrison-Lab/macros@5232f88b31a1bf77fe497633dc785a152e5550a6 🚀
</commit_message>
<xml_diff>
--- a/demo-include-in-header.docx
+++ b/demo-include-in-header.docx
@@ -1781,6 +1781,100 @@
                   </m:r>
                 </m:e>
               </m:acc>
+            </m:oMath>
+            <w:r>
+              <w:t xml:space="preserve">​</w:t>
+            </w:r>
+          </w:p>
+        </w:tc>
+      </w:tr>
+      <w:tr>
+        <w:tc>
+          <w:tcPr/>
+          <w:p>
+            <w:pPr>
+              <w:pStyle w:val="Compact"/>
+            </w:pPr>
+            <w:r>
+              <w:t xml:space="preserve">Sigma-algebra</w:t>
+            </w:r>
+          </w:p>
+        </w:tc>
+        <w:tc>
+          <w:tcPr/>
+          <w:p>
+            <w:pPr>
+              <w:pStyle w:val="Compact"/>
+            </w:pPr>
+            <w:r>
+              <w:rPr>
+                <w:rStyle w:val="VerbatimChar"/>
+              </w:rPr>
+              <w:t xml:space="preserve">\salg</w:t>
+            </w:r>
+          </w:p>
+        </w:tc>
+        <w:tc>
+          <w:tcPr/>
+          <w:p>
+            <w:pPr>
+              <w:pStyle w:val="Compact"/>
+            </w:pPr>
+            <m:oMath>
+              <m:r>
+                <m:rPr>
+                  <m:scr m:val="script"/>
+                  <m:sty m:val="p"/>
+                </m:rPr>
+                <m:t>S</m:t>
+              </m:r>
+            </m:oMath>
+            <w:r>
+              <w:t xml:space="preserve">​</w:t>
+            </w:r>
+          </w:p>
+        </w:tc>
+      </w:tr>
+      <w:tr>
+        <w:tc>
+          <w:tcPr/>
+          <w:p>
+            <w:pPr>
+              <w:pStyle w:val="Compact"/>
+            </w:pPr>
+            <w:r>
+              <w:t xml:space="preserve">Borel sigma-algebra</w:t>
+            </w:r>
+          </w:p>
+        </w:tc>
+        <w:tc>
+          <w:tcPr/>
+          <w:p>
+            <w:pPr>
+              <w:pStyle w:val="Compact"/>
+            </w:pPr>
+            <w:r>
+              <w:rPr>
+                <w:rStyle w:val="VerbatimChar"/>
+              </w:rPr>
+              <w:t xml:space="preserve">\borel</w:t>
+            </w:r>
+          </w:p>
+        </w:tc>
+        <w:tc>
+          <w:tcPr/>
+          <w:p>
+            <w:pPr>
+              <w:pStyle w:val="Compact"/>
+            </w:pPr>
+            <m:oMath>
+              <m:r>
+                <m:rPr>
+                  <m:scr m:val="script"/>
+                  <m:sty m:val="p"/>
+                </m:rPr>
+                <m:t>B</m:t>
+              </m:r>
             </m:oMath>
             <w:r>
               <w:t xml:space="preserve">​</w:t>

</xml_diff>

<commit_message>
Deploying to gh-pages from @ Morrison-Lab/macros@ba7599e24701084edc6383ab6593eafeb8923737 🚀
</commit_message>
<xml_diff>
--- a/demo-include-in-header.docx
+++ b/demo-include-in-header.docx
@@ -1721,16 +1721,21 @@
               <w:pStyle w:val="Compact"/>
             </w:pPr>
             <m:oMath>
-              <m:acc>
-                <m:accPr>
-                  <m:chr m:val="̃"/>
-                </m:accPr>
+              <m:limLow>
                 <m:e>
                   <m:r>
                     <m:t>μ</m:t>
                   </m:r>
                 </m:e>
-              </m:acc>
+                <m:lim>
+                  <m:r>
+                    <m:rPr>
+                      <m:sty m:val="p"/>
+                    </m:rPr>
+                    <m:t>∼</m:t>
+                  </m:r>
+                </m:lim>
+              </m:limLow>
             </m:oMath>
             <w:r>
               <w:t xml:space="preserve">​</w:t>

</xml_diff>

<commit_message>
Deploying to gh-pages from @ Morrison-Lab/macros@ef438552846ba43b81740466599590501cbd7e70 🚀
</commit_message>
<xml_diff>
--- a/demo-include-in-header.docx
+++ b/demo-include-in-header.docx
@@ -1720,23 +1720,9 @@
             <w:pPr>
               <w:pStyle w:val="Compact"/>
             </w:pPr>
-            <m:oMath>
-              <m:limLow>
-                <m:e>
-                  <m:r>
-                    <m:t>μ</m:t>
-                  </m:r>
-                </m:e>
-                <m:lim>
-                  <m:r>
-                    <m:rPr>
-                      <m:sty m:val="p"/>
-                    </m:rPr>
-                    <m:t>∼</m:t>
-                  </m:r>
-                </m:lim>
-              </m:limLow>
-            </m:oMath>
+            <w:r>
+              <w:t xml:space="preserve">$\mathord{\smash[b]{\underset{\raise.3ex\hbox{$\scriptstyle\sim$}}{\mu}}\vphantom{\mu}}$</w:t>
+            </w:r>
             <w:r>
               <w:t xml:space="preserve">​</w:t>
             </w:r>

</xml_diff>